<commit_message>
Deploying to gh-pages from @ eea/CLMS_documents@b9fbfb3aa6c188fb3ef08ac511efe06378b72a45 🚀
</commit_message>
<xml_diff>
--- a/develop/products/High_Resolution_Layer_Vegetated_Land_Cover_Characteristics_ATBD_v2.docx
+++ b/develop/products/High_Resolution_Layer_Vegetated_Land_Cover_Characteristics_ATBD_v2.docx
@@ -9599,13 +9599,14 @@
     <w:tbl>
       <w:tblPr>
         <w:tblStyle w:val="Table"/>
-        <w:tblW w:type="auto" w:w="0"/>
+        <w:tblW w:type="pct" w:w="5000"/>
+        <w:tblLayout w:type="fixed"/>
         <w:tblLook w:firstRow="1" w:lastRow="0" w:firstColumn="0" w:lastColumn="0" w:noHBand="0" w:noVBand="0" w:val="0020"/>
       </w:tblPr>
       <w:tblGrid>
-        <w:gridCol w:w="2640"/>
-        <w:gridCol w:w="2640"/>
-        <w:gridCol w:w="2640"/>
+        <w:gridCol w:w="2782"/>
+        <w:gridCol w:w="2568"/>
+        <w:gridCol w:w="2568"/>
       </w:tblGrid>
       <w:tr>
         <w:trPr>
@@ -19336,6 +19337,10 @@
         <w:t xml:space="preserve"> </w:t>
       </w:r>
       <w:r>
+        <w:rPr>
+          <w:b/>
+          <w:bCs/>
+        </w:rPr>
         <w:t xml:space="preserve">https://land.copernicus.eu/en/products/vegetation</w:t>
       </w:r>
     </w:p>
@@ -19355,6 +19360,10 @@
         <w:t xml:space="preserve"> </w:t>
       </w:r>
       <w:r>
+        <w:rPr>
+          <w:b/>
+          <w:bCs/>
+        </w:rPr>
         <w:t xml:space="preserve">https://land.copernicus.eu/en/products/vegetation</w:t>
       </w:r>
     </w:p>
@@ -19374,6 +19383,10 @@
         <w:t xml:space="preserve"> </w:t>
       </w:r>
       <w:r>
+        <w:rPr>
+          <w:b/>
+          <w:bCs/>
+        </w:rPr>
         <w:t xml:space="preserve">https://land.copernicus.eu/en/products/vegetation</w:t>
       </w:r>
     </w:p>

</xml_diff>